<commit_message>
Use weekly trend chart in sponsor media kit
</commit_message>
<xml_diff>
--- a/docs/rheum-biologics-media-kit.docx
+++ b/docs/rheum-biologics-media-kit.docx
@@ -601,9 +601,9 @@
       <w:r>
         <w:drawing>
           <wp:inline>
-            <wp:extent cx="4907280" cy="2765402"/>
+            <wp:extent cx="4907280" cy="2820050"/>
             <wp:effectExtent b="0" l="0" r="0" t="0"/>
-            <wp:docPr descr="Audience reach trend" title="" id="22" name="Picture"/>
+            <wp:docPr descr="Weekly activity trend" title="" id="22" name="Picture"/>
             <a:graphic>
               <a:graphicData uri="http://schemas.openxmlformats.org/drawingml/2006/picture">
                 <pic:pic>
@@ -622,7 +622,7 @@
                   <pic:spPr bwMode="auto">
                     <a:xfrm>
                       <a:off x="0" y="0"/>
-                      <a:ext cx="4907280" cy="2765402"/>
+                      <a:ext cx="4907280" cy="2820050"/>
                     </a:xfrm>
                     <a:prstGeom prst="rect">
                       <a:avLst/>
@@ -646,7 +646,15 @@
         <w:pStyle w:val="ImageCaption"/>
       </w:pPr>
       <w:r>
-        <w:t xml:space="preserve">Audience reach trend</w:t>
+        <w:t xml:space="preserve">Weekly activity trend</w:t>
+      </w:r>
+    </w:p>
+    <w:p>
+      <w:pPr>
+        <w:pStyle w:val="BodyText"/>
+      </w:pPr>
+      <w:r>
+        <w:t xml:space="preserve">The weekly activity trend covers 15 complete weeks from 4 May to 16 August 2026. The fitted trend line for weekly unique visitors is positive at approximately +4.3 unique visitors per week. The current partial week is excluded.</w:t>
       </w:r>
     </w:p>
     <w:bookmarkEnd w:id="24"/>

</xml_diff>